<commit_message>
added Davanci import step
</commit_message>
<xml_diff>
--- a/Davanci_Step_By_Step_exe_Process.docx
+++ b/Davanci_Step_By_Step_exe_Process.docx
@@ -1,13 +1,1343 @@
 
 <file path=word/document.xml><?xml version="1.0" encoding="utf-8"?>
-<w:document xmlns:wpc="http://schemas.microsoft.com/office/word/2010/wordprocessingCanvas" xmlns:cx="http://schemas.microsoft.com/office/drawing/2014/chartex" xmlns:cx1="http://schemas.microsoft.com/office/drawing/2015/9/8/chartex" xmlns:cx2="http://schemas.microsoft.com/office/drawing/2015/10/21/chartex" xmlns:cx3="http://schemas.microsoft.com/office/drawing/2016/5/9/chartex" xmlns:cx4="http://schemas.microsoft.com/office/drawing/2016/5/10/chartex" xmlns:cx5="http://schemas.microsoft.com/office/drawing/2016/5/11/chartex" xmlns:cx6="http://schemas.microsoft.com/office/drawing/2016/5/12/chartex" xmlns:cx7="http://schemas.microsoft.com/office/drawing/2016/5/13/chartex" xmlns:cx8="http://schemas.microsoft.com/office/drawing/2016/5/14/chartex" xmlns:mc="http://schemas.openxmlformats.org/markup-compatibility/2006" xmlns:aink="http://schemas.microsoft.com/office/drawing/2016/ink" xmlns:am3d="http://schemas.microsoft.com/office/drawing/2017/model3d" xmlns:o="urn:schemas-microsoft-com:office:office" xmlns:oel="http://schemas.microsoft.com/office/2019/extlst" xmlns:r="http://schemas.openxmlformats.org/officeDocument/2006/relationships" xmlns:m="http://schemas.openxmlformats.org/officeDocument/2006/math" xmlns:v="urn:schemas-microsoft-com:vml" xmlns:wp14="http://schemas.microsoft.com/office/word/2010/wordprocessingDrawing" xmlns:wp="http://schemas.openxmlformats.org/drawingml/2006/wordprocessingDrawing" xmlns:w10="urn:schemas-microsoft-com:office:word" xmlns:w="http://schemas.openxmlformats.org/wordprocessingml/2006/main" xmlns:w14="http://schemas.microsoft.com/office/word/2010/wordml" xmlns:w15="http://schemas.microsoft.com/office/word/2012/wordml" xmlns:w16cex="http://schemas.microsoft.com/office/word/2018/wordml/cex" xmlns:w16cid="http://schemas.microsoft.com/office/word/2016/wordml/cid" xmlns:w16="http://schemas.microsoft.com/office/word/2018/wordml" xmlns:w16du="http://schemas.microsoft.com/office/word/2023/wordml/word16du" xmlns:w16sdtdh="http://schemas.microsoft.com/office/word/2020/wordml/sdtdatahash" xmlns:w16sdtfl="http://schemas.microsoft.com/office/word/2024/wordml/sdtformatlock" xmlns:w16se="http://schemas.microsoft.com/office/word/2015/wordml/symex" xmlns:wpg="http://schemas.microsoft.com/office/word/2010/wordprocessingGroup" xmlns:wpi="http://schemas.microsoft.com/office/word/2010/wordprocessingInk" xmlns:wne="http://schemas.microsoft.com/office/word/2006/wordml" xmlns:wps="http://schemas.microsoft.com/office/word/2010/wordprocessingShape" mc:Ignorable="w14 w15 w16se w16cid w16 w16cex w16sdtdh w16sdtfl w16du wp14">
+<w:document xmlns:wpc="http://schemas.microsoft.com/office/word/2010/wordprocessingCanvas" xmlns:cx="http://schemas.microsoft.com/office/drawing/2014/chartex" xmlns:cx1="http://schemas.microsoft.com/office/drawing/2015/9/8/chartex" xmlns:cx2="http://schemas.microsoft.com/office/drawing/2015/10/21/chartex" xmlns:cx3="http://schemas.microsoft.com/office/drawing/2016/5/9/chartex" xmlns:cx4="http://schemas.microsoft.com/office/drawing/2016/5/10/chartex" xmlns:cx5="http://schemas.microsoft.com/office/drawing/2016/5/11/chartex" xmlns:cx6="http://schemas.microsoft.com/office/drawing/2016/5/12/chartex" xmlns:cx7="http://schemas.microsoft.com/office/drawing/2016/5/13/chartex" xmlns:cx8="http://schemas.microsoft.com/office/drawing/2016/5/14/chartex" xmlns:mc="http://schemas.openxmlformats.org/markup-compatibility/2006" xmlns:aink="http://schemas.microsoft.com/office/drawing/2016/ink" xmlns:am3d="http://schemas.microsoft.com/office/drawing/2017/model3d" xmlns:o="urn:schemas-microsoft-com:office:office" xmlns:oel="http://schemas.microsoft.com/office/2019/extlst" xmlns:r="http://schemas.openxmlformats.org/officeDocument/2006/relationships" xmlns:m="http://schemas.openxmlformats.org/officeDocument/2006/math" xmlns:v="urn:schemas-microsoft-com:vml" xmlns:wp14="http://schemas.microsoft.com/office/word/2010/wordprocessingDrawing" xmlns:wp="http://schemas.openxmlformats.org/drawingml/2006/wordprocessingDrawing" xmlns:w10="urn:schemas-microsoft-com:office:word" xmlns:w="http://schemas.openxmlformats.org/wordprocessingml/2006/main" xmlns:w14="http://schemas.microsoft.com/office/word/2010/wordml" xmlns:w15="http://schemas.microsoft.com/office/word/2012/wordml" xmlns:w16cei="http://schemas.microsoft.com/office/word/2026/wordml/cei" xmlns:w16cex="http://schemas.microsoft.com/office/word/2018/wordml/cex" xmlns:w16cid="http://schemas.microsoft.com/office/word/2016/wordml/cid" xmlns:w16="http://schemas.microsoft.com/office/word/2018/wordml" xmlns:w16du="http://schemas.microsoft.com/office/word/2023/wordml/word16du" xmlns:w16sdtdh="http://schemas.microsoft.com/office/word/2020/wordml/sdtdatahash" xmlns:w16sdtfl="http://schemas.microsoft.com/office/word/2024/wordml/sdtformatlock" xmlns:w16se="http://schemas.microsoft.com/office/word/2015/wordml/symex" xmlns:wpg="http://schemas.microsoft.com/office/word/2010/wordprocessingGroup" xmlns:wpi="http://schemas.microsoft.com/office/word/2010/wordprocessingInk" xmlns:wne="http://schemas.microsoft.com/office/word/2006/wordml" xmlns:wps="http://schemas.microsoft.com/office/word/2010/wordprocessingShape" mc:Ignorable="w14 w15 w16se w16cid w16 w16cex w16sdtdh w16sdtfl w16du wp14">
   <w:body>
     <w:p>
       <w:pPr>
+        <w:rPr>
+          <w:b/>
+          <w:bCs/>
+        </w:rPr>
+      </w:pPr>
+      <w:r>
+        <w:rPr>
+          <w:b/>
+          <w:bCs/>
+        </w:rPr>
+        <w:t>Davinci Configuration</w:t>
+      </w:r>
+      <w:r>
+        <w:rPr>
+          <w:b/>
+          <w:bCs/>
+        </w:rPr>
+        <w:t>:</w:t>
+      </w:r>
+      <w:r>
+        <w:rPr>
+          <w:b/>
+          <w:bCs/>
+        </w:rPr>
+        <w:t xml:space="preserve"> (</w:t>
+      </w:r>
+      <w:proofErr w:type="spellStart"/>
+      <w:r>
+        <w:rPr>
+          <w:b/>
+          <w:bCs/>
+        </w:rPr>
+        <w:t>Dbc</w:t>
+      </w:r>
+      <w:proofErr w:type="spellEnd"/>
+      <w:r>
+        <w:rPr>
+          <w:b/>
+          <w:bCs/>
+        </w:rPr>
+        <w:t xml:space="preserve"> Import):</w:t>
+      </w:r>
+    </w:p>
+    <w:p>
+      <w:r>
+        <w:t xml:space="preserve">Input file format: </w:t>
+      </w:r>
+    </w:p>
+    <w:p>
+      <w:r>
+        <w:t>.</w:t>
+      </w:r>
+      <w:proofErr w:type="spellStart"/>
+      <w:r>
+        <w:t>dbc</w:t>
+      </w:r>
+      <w:proofErr w:type="spellEnd"/>
+      <w:r>
+        <w:t xml:space="preserve"> </w:t>
+      </w:r>
+      <w:r>
+        <w:sym w:font="Wingdings" w:char="F0E0"/>
+      </w:r>
+      <w:r>
+        <w:t xml:space="preserve">(Holds info like Network, ECU name, CAN </w:t>
+      </w:r>
+      <w:proofErr w:type="spellStart"/>
+      <w:r>
+        <w:t>Meaages</w:t>
+      </w:r>
+      <w:proofErr w:type="spellEnd"/>
+      <w:r>
+        <w:t>, Signals)</w:t>
+      </w:r>
+    </w:p>
+    <w:p>
+      <w:proofErr w:type="spellStart"/>
+      <w:r>
+        <w:t>C</w:t>
+      </w:r>
+      <w:r>
+        <w:t>dd</w:t>
+      </w:r>
+      <w:proofErr w:type="spellEnd"/>
+      <w:r>
+        <w:t xml:space="preserve"> </w:t>
+      </w:r>
+      <w:r>
+        <w:sym w:font="Wingdings" w:char="F0E0"/>
+      </w:r>
+      <w:r>
+        <w:t xml:space="preserve"> (</w:t>
+      </w:r>
+      <w:proofErr w:type="spellStart"/>
+      <w:r>
+        <w:t>Dignostic</w:t>
+      </w:r>
+      <w:proofErr w:type="spellEnd"/>
+      <w:r>
+        <w:t xml:space="preserve"> related </w:t>
+      </w:r>
+      <w:proofErr w:type="spellStart"/>
+      <w:r>
+        <w:t>infro</w:t>
+      </w:r>
+      <w:proofErr w:type="spellEnd"/>
+      <w:r>
+        <w:t xml:space="preserve"> specially SID, NRCs)</w:t>
+      </w:r>
+    </w:p>
+    <w:p>
+      <w:r>
+        <w:t xml:space="preserve">Fault </w:t>
+      </w:r>
+      <w:r>
+        <w:t>matrix</w:t>
+      </w:r>
+      <w:r>
+        <w:t xml:space="preserve"> sheet</w:t>
+      </w:r>
+      <w:r>
+        <w:t xml:space="preserve"> </w:t>
+      </w:r>
+      <w:r>
+        <w:sym w:font="Wingdings" w:char="F0E0"/>
+      </w:r>
+      <w:r>
+        <w:t xml:space="preserve"> (DEM related faults, fault co</w:t>
+      </w:r>
+      <w:r>
+        <w:t>ndition)</w:t>
+      </w:r>
+    </w:p>
+    <w:p/>
+    <w:p>
+      <w:pPr>
+        <w:rPr>
+          <w:b/>
+          <w:bCs/>
+        </w:rPr>
+      </w:pPr>
+      <w:r>
+        <w:rPr>
+          <w:b/>
+          <w:bCs/>
+        </w:rPr>
+        <w:t>Import step:</w:t>
+      </w:r>
+    </w:p>
+    <w:p>
+      <w:pPr>
+        <w:pStyle w:val="ListParagraph"/>
+        <w:numPr>
+          <w:ilvl w:val="0"/>
+          <w:numId w:val="5"/>
+        </w:numPr>
+      </w:pPr>
+      <w:r>
+        <w:t xml:space="preserve">For </w:t>
+      </w:r>
+      <w:r>
+        <w:t>Davinci</w:t>
+      </w:r>
+      <w:r>
+        <w:t xml:space="preserve"> configurator Input file </w:t>
+      </w:r>
+      <w:proofErr w:type="gramStart"/>
+      <w:r>
+        <w:t>is .dpa</w:t>
+      </w:r>
+      <w:proofErr w:type="gramEnd"/>
+      <w:r>
+        <w:t xml:space="preserve"> (Davinci Project assist)</w:t>
+      </w:r>
+    </w:p>
+    <w:p>
+      <w:pPr>
+        <w:ind w:left="720" w:firstLine="360"/>
+      </w:pPr>
+      <w:r>
+        <w:t>d</w:t>
+      </w:r>
+      <w:r>
+        <w:t xml:space="preserve">pa -&gt; </w:t>
+      </w:r>
+      <w:r>
+        <w:t>H</w:t>
+      </w:r>
+      <w:r>
+        <w:t>o</w:t>
+      </w:r>
+      <w:r>
+        <w:t>l</w:t>
+      </w:r>
+      <w:r>
+        <w:t>ds</w:t>
+      </w:r>
+      <w:r>
+        <w:t xml:space="preserve"> </w:t>
+      </w:r>
+      <w:r>
+        <w:t>Module configur</w:t>
+      </w:r>
+      <w:r>
+        <w:t>ation</w:t>
+      </w:r>
+      <w:r>
+        <w:t xml:space="preserve"> </w:t>
+      </w:r>
+      <w:r>
+        <w:t xml:space="preserve">ECU arxml path. </w:t>
+      </w:r>
+    </w:p>
+    <w:p>
+      <w:pPr>
+        <w:ind w:left="720" w:firstLine="360"/>
+        <w:rPr>
+          <w:lang w:val="fr-FR"/>
+        </w:rPr>
+      </w:pPr>
+      <w:r>
+        <w:rPr>
+          <w:lang w:val="fr-FR"/>
+        </w:rPr>
+        <w:t>Arxml :</w:t>
+      </w:r>
+      <w:r>
+        <w:rPr>
+          <w:lang w:val="fr-FR"/>
+        </w:rPr>
+        <w:t xml:space="preserve"> Autosar extension </w:t>
+      </w:r>
+      <w:r>
+        <w:rPr>
+          <w:lang w:val="fr-FR"/>
+        </w:rPr>
+        <w:t xml:space="preserve">markup </w:t>
+      </w:r>
+      <w:r>
+        <w:rPr>
+          <w:lang w:val="fr-FR"/>
+        </w:rPr>
+        <w:t>lan</w:t>
+      </w:r>
+      <w:r>
+        <w:rPr>
+          <w:lang w:val="fr-FR"/>
+        </w:rPr>
+        <w:t>gage</w:t>
+      </w:r>
+      <w:r>
+        <w:rPr>
+          <w:lang w:val="fr-FR"/>
+        </w:rPr>
+        <w:t>.</w:t>
+      </w:r>
+    </w:p>
+    <w:p>
+      <w:pPr>
+        <w:ind w:left="720" w:firstLine="360"/>
+        <w:rPr>
+          <w:lang w:val="fr-FR"/>
+        </w:rPr>
+      </w:pPr>
+    </w:p>
+    <w:p>
+      <w:pPr>
+        <w:rPr>
+          <w:b/>
+          <w:bCs/>
+        </w:rPr>
+      </w:pPr>
+      <w:r>
+        <w:rPr>
+          <w:b/>
+          <w:bCs/>
+        </w:rPr>
+        <w:t>Step to opening Davinci Configurator Pro:</w:t>
+      </w:r>
+    </w:p>
+    <w:p>
+      <w:pPr>
+        <w:pStyle w:val="ListParagraph"/>
+        <w:numPr>
+          <w:ilvl w:val="0"/>
+          <w:numId w:val="5"/>
+        </w:numPr>
+        <w:rPr>
+          <w:b/>
+          <w:bCs/>
+        </w:rPr>
+      </w:pPr>
+      <w:r>
+        <w:t xml:space="preserve">Go to project Stack check </w:t>
+      </w:r>
+      <w:proofErr w:type="gramStart"/>
+      <w:r>
+        <w:t>for .dpa</w:t>
+      </w:r>
+      <w:proofErr w:type="gramEnd"/>
+      <w:r>
+        <w:t xml:space="preserve"> exe file </w:t>
+      </w:r>
+      <w:r>
+        <w:sym w:font="Wingdings" w:char="F0E0"/>
+      </w:r>
+      <w:r>
+        <w:t xml:space="preserve"> </w:t>
+      </w:r>
+      <w:r>
+        <w:t xml:space="preserve">right click </w:t>
+      </w:r>
+      <w:proofErr w:type="gramStart"/>
+      <w:r>
+        <w:t>on .dpa</w:t>
+      </w:r>
+      <w:proofErr w:type="gramEnd"/>
+      <w:r>
+        <w:t xml:space="preserve"> </w:t>
+      </w:r>
+      <w:r>
+        <w:sym w:font="Wingdings" w:char="F0E0"/>
+      </w:r>
+      <w:r>
+        <w:t xml:space="preserve"> </w:t>
+      </w:r>
+    </w:p>
+    <w:p>
+      <w:pPr>
+        <w:pStyle w:val="ListParagraph"/>
+        <w:ind w:left="1080"/>
+      </w:pPr>
+      <w:r>
+        <w:t xml:space="preserve">more option </w:t>
+      </w:r>
+      <w:r>
+        <w:sym w:font="Wingdings" w:char="F0E0"/>
+      </w:r>
+      <w:r>
+        <w:t xml:space="preserve"> </w:t>
+      </w:r>
+      <w:r>
+        <w:t>a. BSW</w:t>
+      </w:r>
+      <w:r>
+        <w:t xml:space="preserve">       </w:t>
+      </w:r>
+      <w:r>
+        <w:sym w:font="Wingdings" w:char="F0E0"/>
+      </w:r>
+      <w:r>
+        <w:t xml:space="preserve"> For BSW</w:t>
+      </w:r>
+    </w:p>
+    <w:p>
+      <w:pPr>
+        <w:pStyle w:val="ListParagraph"/>
+        <w:numPr>
+          <w:ilvl w:val="0"/>
+          <w:numId w:val="6"/>
+        </w:numPr>
+        <w:rPr>
+          <w:b/>
+          <w:bCs/>
+        </w:rPr>
+      </w:pPr>
+      <w:r>
+        <w:t>b. ASW</w:t>
+      </w:r>
+      <w:r>
+        <w:t xml:space="preserve">     </w:t>
+      </w:r>
+      <w:r>
+        <w:sym w:font="Wingdings" w:char="F0E0"/>
+      </w:r>
+      <w:r>
+        <w:t xml:space="preserve"> For Appl</w:t>
+      </w:r>
+    </w:p>
+    <w:p>
+      <w:pPr>
+        <w:pStyle w:val="ListParagraph"/>
+        <w:ind w:left="2760"/>
+      </w:pPr>
+    </w:p>
+    <w:p>
+      <w:pPr>
+        <w:pStyle w:val="ListParagraph"/>
+        <w:numPr>
+          <w:ilvl w:val="0"/>
+          <w:numId w:val="6"/>
+        </w:numPr>
+        <w:rPr>
+          <w:b/>
+          <w:bCs/>
+        </w:rPr>
+      </w:pPr>
+      <w:r>
+        <w:t xml:space="preserve">Click </w:t>
+      </w:r>
+      <w:r>
+        <w:t>on,</w:t>
+      </w:r>
+      <w:r>
+        <w:t xml:space="preserve"> I accept.</w:t>
+      </w:r>
+    </w:p>
+    <w:p>
+      <w:pPr>
+        <w:pStyle w:val="ListParagraph"/>
+        <w:numPr>
+          <w:ilvl w:val="0"/>
+          <w:numId w:val="5"/>
+        </w:numPr>
+        <w:rPr>
+          <w:b/>
+          <w:bCs/>
+        </w:rPr>
+      </w:pPr>
+      <w:r>
+        <w:t xml:space="preserve">Once open </w:t>
+      </w:r>
+      <w:r>
+        <w:t xml:space="preserve">go to Basic </w:t>
+      </w:r>
+      <w:proofErr w:type="gramStart"/>
+      <w:r>
+        <w:t>editor</w:t>
+      </w:r>
+      <w:r>
+        <w:t>(</w:t>
+      </w:r>
+      <w:proofErr w:type="gramEnd"/>
+      <w:r>
+        <w:t>holds all project related all modules)</w:t>
+      </w:r>
+      <w:r>
+        <w:t>.</w:t>
+      </w:r>
+    </w:p>
+    <w:p>
+      <w:pPr>
+        <w:pStyle w:val="ListParagraph"/>
+        <w:numPr>
+          <w:ilvl w:val="0"/>
+          <w:numId w:val="5"/>
+        </w:numPr>
+        <w:rPr>
+          <w:b/>
+          <w:bCs/>
+        </w:rPr>
+      </w:pPr>
+      <w:r>
+        <w:t xml:space="preserve">Project </w:t>
+      </w:r>
+      <w:r>
+        <w:sym w:font="Wingdings" w:char="F0E0"/>
+      </w:r>
+      <w:r>
+        <w:t xml:space="preserve"> I/P Files </w:t>
+      </w:r>
+      <w:r>
+        <w:sym w:font="Wingdings" w:char="F0E0"/>
+      </w:r>
+      <w:r>
+        <w:t xml:space="preserve"> </w:t>
+      </w:r>
+      <w:proofErr w:type="spellStart"/>
+      <w:r>
+        <w:t>c</w:t>
+      </w:r>
+      <w:r>
+        <w:t>dd</w:t>
+      </w:r>
+      <w:proofErr w:type="spellEnd"/>
+      <w:r>
+        <w:t xml:space="preserve">, </w:t>
+      </w:r>
+      <w:proofErr w:type="spellStart"/>
+      <w:r>
+        <w:t>dbc</w:t>
+      </w:r>
+      <w:proofErr w:type="spellEnd"/>
+      <w:r>
+        <w:t xml:space="preserve"> (import)</w:t>
+      </w:r>
+    </w:p>
+    <w:p>
+      <w:pPr>
+        <w:pStyle w:val="ListParagraph"/>
+        <w:numPr>
+          <w:ilvl w:val="0"/>
+          <w:numId w:val="5"/>
+        </w:numPr>
+        <w:rPr>
+          <w:b/>
+          <w:bCs/>
+        </w:rPr>
+      </w:pPr>
+      <w:r>
+        <w:t xml:space="preserve">View </w:t>
+      </w:r>
+      <w:r>
+        <w:sym w:font="Wingdings" w:char="F0E0"/>
+      </w:r>
+      <w:r>
+        <w:t xml:space="preserve"> option down </w:t>
+      </w:r>
+      <w:r>
+        <w:t>consoles</w:t>
+      </w:r>
+      <w:r>
+        <w:t xml:space="preserve"> open option.</w:t>
+      </w:r>
+    </w:p>
+    <w:p>
+      <w:pPr>
+        <w:rPr>
+          <w:b/>
+          <w:bCs/>
+        </w:rPr>
+      </w:pPr>
+      <w:r>
+        <w:rPr>
+          <w:b/>
+          <w:bCs/>
+        </w:rPr>
+        <w:t>Another</w:t>
+      </w:r>
+      <w:r>
+        <w:rPr>
+          <w:b/>
+          <w:bCs/>
+        </w:rPr>
+        <w:t xml:space="preserve"> Way to open .dpa file.</w:t>
+      </w:r>
+    </w:p>
+    <w:p>
+      <w:pPr>
+        <w:pStyle w:val="ListParagraph"/>
+        <w:numPr>
+          <w:ilvl w:val="0"/>
+          <w:numId w:val="7"/>
+        </w:numPr>
+      </w:pPr>
+      <w:r>
+        <w:t xml:space="preserve">Go to start search bar </w:t>
+      </w:r>
+      <w:r>
+        <w:sym w:font="Wingdings" w:char="F0E0"/>
+      </w:r>
+      <w:r>
+        <w:t xml:space="preserve"> type con</w:t>
+      </w:r>
+      <w:r>
+        <w:t xml:space="preserve">figurator </w:t>
+      </w:r>
+      <w:r>
+        <w:sym w:font="Wingdings" w:char="F0E0"/>
+      </w:r>
+      <w:r>
+        <w:t xml:space="preserve"> once open </w:t>
+      </w:r>
+      <w:r>
+        <w:sym w:font="Wingdings" w:char="F0E0"/>
+      </w:r>
+      <w:r>
+        <w:t xml:space="preserve"> file </w:t>
+      </w:r>
+      <w:r>
+        <w:sym w:font="Wingdings" w:char="F0E0"/>
+      </w:r>
+      <w:r>
+        <w:t xml:space="preserve"> import </w:t>
+      </w:r>
+      <w:r>
+        <w:sym w:font="Wingdings" w:char="F0E0"/>
+      </w:r>
+      <w:r>
+        <w:t xml:space="preserve"> + </w:t>
+      </w:r>
+      <w:r>
+        <w:sym w:font="Wingdings" w:char="F0E0"/>
+      </w:r>
+      <w:r>
+        <w:t xml:space="preserve"> </w:t>
+      </w:r>
+      <w:proofErr w:type="gramStart"/>
+      <w:r>
+        <w:t>select .dpa</w:t>
+      </w:r>
+      <w:proofErr w:type="gramEnd"/>
+      <w:r>
+        <w:t xml:space="preserve"> </w:t>
+      </w:r>
+      <w:r>
+        <w:sym w:font="Wingdings" w:char="F0E0"/>
+      </w:r>
+      <w:r>
+        <w:t xml:space="preserve"> open</w:t>
+      </w:r>
+    </w:p>
+    <w:p>
+      <w:pPr>
+        <w:pStyle w:val="ListParagraph"/>
+      </w:pPr>
+    </w:p>
+    <w:p>
+      <w:pPr>
+        <w:pStyle w:val="ListParagraph"/>
+        <w:numPr>
+          <w:ilvl w:val="0"/>
+          <w:numId w:val="7"/>
+        </w:numPr>
+      </w:pPr>
+      <w:r>
+        <w:t xml:space="preserve">After all </w:t>
+      </w:r>
+      <w:proofErr w:type="gramStart"/>
+      <w:r>
+        <w:t>configuration</w:t>
+      </w:r>
+      <w:proofErr w:type="gramEnd"/>
+      <w:r>
+        <w:t xml:space="preserve"> done </w:t>
+      </w:r>
+      <w:r>
+        <w:sym w:font="Wingdings" w:char="F0E0"/>
+      </w:r>
+      <w:r>
+        <w:t xml:space="preserve"> give on </w:t>
+      </w:r>
+      <w:r>
+        <w:t>demand generator validation –</w:t>
+      </w:r>
+      <w:r>
+        <w:t>&gt;</w:t>
+      </w:r>
+      <w:r>
+        <w:t xml:space="preserve"> (</w:t>
+      </w:r>
+      <w:r>
+        <w:t xml:space="preserve">for validation and generation </w:t>
+      </w:r>
+      <w:proofErr w:type="gramStart"/>
+      <w:r>
+        <w:t>module)(</w:t>
+      </w:r>
+      <w:proofErr w:type="gramEnd"/>
+      <w:r>
+        <w:t>F8)</w:t>
+      </w:r>
+      <w:r>
+        <w:t xml:space="preserve"> </w:t>
+      </w:r>
+      <w:r>
+        <w:sym w:font="Wingdings" w:char="F0E0"/>
+      </w:r>
+      <w:r>
+        <w:t xml:space="preserve"> For validation.</w:t>
+      </w:r>
+    </w:p>
+    <w:p>
+      <w:pPr>
+        <w:pStyle w:val="ListParagraph"/>
+      </w:pPr>
+    </w:p>
+    <w:p>
+      <w:pPr>
+        <w:pStyle w:val="ListParagraph"/>
+        <w:numPr>
+          <w:ilvl w:val="0"/>
+          <w:numId w:val="7"/>
+        </w:numPr>
+      </w:pPr>
+      <w:r>
+        <w:t xml:space="preserve">After clicking validation and generation </w:t>
+      </w:r>
+      <w:r>
+        <w:sym w:font="Wingdings" w:char="F0E0"/>
+      </w:r>
+      <w:r>
+        <w:t xml:space="preserve"> in window left side </w:t>
+      </w:r>
+      <w:r>
+        <w:sym w:font="Wingdings" w:char="F0E0"/>
+      </w:r>
+      <w:r>
+        <w:t xml:space="preserve"> </w:t>
+      </w:r>
+      <w:r>
+        <w:t xml:space="preserve">Deselect all </w:t>
+      </w:r>
+      <w:r>
+        <w:sym w:font="Wingdings" w:char="F0E0"/>
+      </w:r>
+      <w:r>
+        <w:t xml:space="preserve"> select which modules you changed based on Client Requirements </w:t>
+      </w:r>
+      <w:r>
+        <w:sym w:font="Wingdings" w:char="F0E0"/>
+      </w:r>
+      <w:r>
+        <w:t xml:space="preserve"> validate it </w:t>
+      </w:r>
+      <w:r>
+        <w:sym w:font="Wingdings" w:char="F0E0"/>
+      </w:r>
+      <w:r>
+        <w:t xml:space="preserve"> </w:t>
+      </w:r>
+    </w:p>
+    <w:p>
+      <w:pPr>
+        <w:pStyle w:val="ListParagraph"/>
+      </w:pPr>
+    </w:p>
+    <w:p>
+      <w:pPr>
+        <w:pStyle w:val="ListParagraph"/>
+        <w:numPr>
+          <w:ilvl w:val="0"/>
+          <w:numId w:val="7"/>
+        </w:numPr>
+      </w:pPr>
+      <w:r>
+        <w:lastRenderedPageBreak/>
+        <w:t xml:space="preserve">Generate (F9) </w:t>
+      </w:r>
+      <w:r>
+        <w:sym w:font="Wingdings" w:char="F0E0"/>
+      </w:r>
+      <w:r>
+        <w:t xml:space="preserve"> generate arxml files </w:t>
+      </w:r>
+      <w:r>
+        <w:sym w:font="Wingdings" w:char="F0E0"/>
+      </w:r>
+      <w:r>
+        <w:t xml:space="preserve"> </w:t>
+      </w:r>
+      <w:r>
+        <w:t xml:space="preserve">follow same for generation file (Deselect </w:t>
+      </w:r>
+      <w:r>
+        <w:t>unchanged</w:t>
+      </w:r>
+      <w:r>
+        <w:t xml:space="preserve"> module) and generate</w:t>
+      </w:r>
+    </w:p>
+    <w:p>
+      <w:pPr>
+        <w:pStyle w:val="ListParagraph"/>
+      </w:pPr>
+    </w:p>
+    <w:p>
+      <w:pPr>
+        <w:pStyle w:val="ListParagraph"/>
+        <w:numPr>
+          <w:ilvl w:val="0"/>
+          <w:numId w:val="7"/>
+        </w:numPr>
+      </w:pPr>
+      <w:r>
+        <w:t xml:space="preserve">Down validation window </w:t>
+      </w:r>
+      <w:r>
+        <w:sym w:font="Wingdings" w:char="F0E0"/>
+      </w:r>
+      <w:r>
+        <w:t xml:space="preserve"> error show </w:t>
+      </w:r>
+    </w:p>
+    <w:p>
+      <w:pPr>
+        <w:pStyle w:val="ListParagraph"/>
+      </w:pPr>
+    </w:p>
+    <w:p>
+      <w:pPr>
+        <w:pStyle w:val="ListParagraph"/>
+        <w:numPr>
+          <w:ilvl w:val="0"/>
+          <w:numId w:val="7"/>
+        </w:numPr>
+      </w:pPr>
+      <w:r>
+        <w:t>Parameter Description</w:t>
+      </w:r>
+      <w:r>
+        <w:t xml:space="preserve"> </w:t>
+      </w:r>
+      <w:r>
+        <w:sym w:font="Wingdings" w:char="F0E0"/>
+      </w:r>
+      <w:r>
+        <w:t xml:space="preserve"> left down properties window</w:t>
+      </w:r>
+    </w:p>
+    <w:p>
+      <w:pPr>
+        <w:pStyle w:val="ListParagraph"/>
+      </w:pPr>
+    </w:p>
+    <w:p>
+      <w:pPr>
+        <w:pStyle w:val="ListParagraph"/>
+        <w:numPr>
+          <w:ilvl w:val="0"/>
+          <w:numId w:val="7"/>
+        </w:numPr>
+      </w:pPr>
+      <w:r>
+        <w:t xml:space="preserve">If all configuration properties done </w:t>
+      </w:r>
+      <w:r>
+        <w:sym w:font="Wingdings" w:char="F0E0"/>
+      </w:r>
+      <w:r>
+        <w:t xml:space="preserve"> generate files in </w:t>
+      </w:r>
+      <w:proofErr w:type="spellStart"/>
+      <w:r>
+        <w:t>Gendata</w:t>
+      </w:r>
+      <w:proofErr w:type="spellEnd"/>
+      <w:r>
+        <w:t xml:space="preserve"> folder (</w:t>
+      </w:r>
+      <w:r>
+        <w:t>with Updated date)</w:t>
+      </w:r>
+    </w:p>
+    <w:p>
+      <w:pPr>
+        <w:pStyle w:val="ListParagraph"/>
+      </w:pPr>
+    </w:p>
+    <w:p>
+      <w:pPr>
+        <w:pStyle w:val="ListParagraph"/>
+        <w:numPr>
+          <w:ilvl w:val="0"/>
+          <w:numId w:val="7"/>
+        </w:numPr>
+      </w:pPr>
+      <w:r>
+        <w:t>Import .</w:t>
+      </w:r>
+      <w:proofErr w:type="spellStart"/>
+      <w:r>
+        <w:t>dbc</w:t>
+      </w:r>
+      <w:proofErr w:type="spellEnd"/>
+      <w:r>
+        <w:t xml:space="preserve">, </w:t>
+      </w:r>
+      <w:proofErr w:type="spellStart"/>
+      <w:r>
+        <w:t>cdd</w:t>
+      </w:r>
+      <w:proofErr w:type="spellEnd"/>
+      <w:r>
+        <w:t xml:space="preserve">, files </w:t>
+      </w:r>
+      <w:r>
+        <w:sym w:font="Wingdings" w:char="F0E0"/>
+      </w:r>
+      <w:r>
+        <w:t xml:space="preserve"> Click on Project</w:t>
+      </w:r>
+      <w:r>
+        <w:sym w:font="Wingdings" w:char="F0E0"/>
+      </w:r>
+      <w:r>
+        <w:t xml:space="preserve"> </w:t>
+      </w:r>
+      <w:r>
+        <w:t xml:space="preserve">Input files </w:t>
+      </w:r>
+      <w:r>
+        <w:sym w:font="Wingdings" w:char="F0E0"/>
+      </w:r>
+      <w:r>
+        <w:t xml:space="preserve"> path for +mark </w:t>
+      </w:r>
+      <w:proofErr w:type="spellStart"/>
+      <w:r>
+        <w:t>dbc</w:t>
+      </w:r>
+      <w:proofErr w:type="spellEnd"/>
+      <w:r>
+        <w:t>/</w:t>
+      </w:r>
+      <w:proofErr w:type="spellStart"/>
+      <w:r>
+        <w:t>cdd</w:t>
+      </w:r>
+      <w:proofErr w:type="spellEnd"/>
+      <w:r>
+        <w:t xml:space="preserve"> </w:t>
+      </w:r>
+      <w:r>
+        <w:sym w:font="Wingdings" w:char="F0E0"/>
+      </w:r>
+      <w:r>
+        <w:t xml:space="preserve"> arxml path </w:t>
+      </w:r>
+      <w:r>
+        <w:sym w:font="Wingdings" w:char="F0E0"/>
+      </w:r>
+      <w:r>
+        <w:t xml:space="preserve"> start </w:t>
+      </w:r>
+      <w:r>
+        <w:t xml:space="preserve">flow/Update </w:t>
+      </w:r>
+      <w:r>
+        <w:sym w:font="Wingdings" w:char="F0E0"/>
+      </w:r>
+      <w:r>
+        <w:t xml:space="preserve"> click </w:t>
+      </w:r>
+      <w:r>
+        <w:sym w:font="Wingdings" w:char="F0E0"/>
+      </w:r>
+      <w:r>
+        <w:t xml:space="preserve"> after that it will update all configuration </w:t>
+      </w:r>
+      <w:r>
+        <w:t xml:space="preserve">as per </w:t>
+      </w:r>
+      <w:proofErr w:type="spellStart"/>
+      <w:r>
+        <w:t>cdd</w:t>
+      </w:r>
+      <w:proofErr w:type="spellEnd"/>
+      <w:r>
+        <w:t>/</w:t>
+      </w:r>
+      <w:proofErr w:type="spellStart"/>
+      <w:r>
+        <w:t>dbc</w:t>
+      </w:r>
+      <w:proofErr w:type="spellEnd"/>
+      <w:r>
+        <w:t xml:space="preserve"> files.</w:t>
+      </w:r>
+    </w:p>
+    <w:p>
+      <w:pPr>
+        <w:pStyle w:val="ListParagraph"/>
+      </w:pPr>
+    </w:p>
+    <w:p>
+      <w:pPr>
+        <w:rPr>
+          <w:b/>
+          <w:bCs/>
+        </w:rPr>
+      </w:pPr>
+      <w:r>
+        <w:rPr>
+          <w:b/>
+          <w:bCs/>
+        </w:rPr>
+        <w:t>Davinci Congi and Dev:</w:t>
+      </w:r>
+    </w:p>
+    <w:p>
+      <w:pPr>
+        <w:pStyle w:val="ListParagraph"/>
+        <w:numPr>
+          <w:ilvl w:val="0"/>
+          <w:numId w:val="9"/>
+        </w:numPr>
+      </w:pPr>
+      <w:r>
+        <w:t>Set up Project</w:t>
+      </w:r>
+    </w:p>
+    <w:p>
+      <w:pPr>
+        <w:pStyle w:val="ListParagraph"/>
+        <w:numPr>
+          <w:ilvl w:val="0"/>
+          <w:numId w:val="9"/>
+        </w:numPr>
+      </w:pPr>
+      <w:r>
+        <w:t>Define Project setting</w:t>
+      </w:r>
+    </w:p>
+    <w:p>
+      <w:pPr>
+        <w:pStyle w:val="ListParagraph"/>
+        <w:numPr>
+          <w:ilvl w:val="0"/>
+          <w:numId w:val="9"/>
+        </w:numPr>
+      </w:pPr>
+      <w:r>
+        <w:t>Validation</w:t>
+      </w:r>
+    </w:p>
+    <w:p>
+      <w:pPr>
+        <w:pStyle w:val="ListParagraph"/>
+        <w:numPr>
+          <w:ilvl w:val="0"/>
+          <w:numId w:val="9"/>
+        </w:numPr>
+      </w:pPr>
+      <w:r>
+        <w:t>Start BSW configuration</w:t>
+      </w:r>
+    </w:p>
+    <w:p>
+      <w:pPr>
+        <w:pStyle w:val="ListParagraph"/>
+        <w:numPr>
+          <w:ilvl w:val="0"/>
+          <w:numId w:val="9"/>
+        </w:numPr>
+      </w:pPr>
+      <w:r>
+        <w:t>Design SWc</w:t>
+      </w:r>
+    </w:p>
+    <w:p>
+      <w:pPr>
+        <w:pStyle w:val="ListParagraph"/>
+        <w:numPr>
+          <w:ilvl w:val="0"/>
+          <w:numId w:val="9"/>
+        </w:numPr>
+      </w:pPr>
+      <w:r>
+        <w:t>Mappings</w:t>
+      </w:r>
+    </w:p>
+    <w:p>
+      <w:pPr>
+        <w:pStyle w:val="ListParagraph"/>
+        <w:numPr>
+          <w:ilvl w:val="0"/>
+          <w:numId w:val="9"/>
+        </w:numPr>
+      </w:pPr>
+      <w:r>
+        <w:t>Code generation</w:t>
+      </w:r>
+    </w:p>
+    <w:p>
+      <w:pPr>
+        <w:pStyle w:val="ListParagraph"/>
+        <w:numPr>
+          <w:ilvl w:val="0"/>
+          <w:numId w:val="9"/>
+        </w:numPr>
+      </w:pPr>
+      <w:r>
+        <w:t>Add Runnable code</w:t>
+      </w:r>
+    </w:p>
+    <w:p>
+      <w:pPr>
+        <w:pStyle w:val="ListParagraph"/>
+        <w:numPr>
+          <w:ilvl w:val="0"/>
+          <w:numId w:val="9"/>
+        </w:numPr>
+      </w:pPr>
+      <w:r>
+        <w:t>Compile, Link, And Test</w:t>
+      </w:r>
+    </w:p>
+    <w:p/>
+    <w:p>
+      <w:pPr>
+        <w:rPr>
+          <w:b/>
+          <w:bCs/>
+        </w:rPr>
+      </w:pPr>
+      <w:r>
+        <w:rPr>
+          <w:b/>
+          <w:bCs/>
+        </w:rPr>
+        <w:t>Folder Structure:</w:t>
+      </w:r>
+    </w:p>
+    <w:p>
+      <w:r>
+        <w:rPr>
+          <w:b/>
+          <w:bCs/>
+        </w:rPr>
+        <w:t xml:space="preserve">Appl: </w:t>
+      </w:r>
+      <w:proofErr w:type="spellStart"/>
+      <w:r>
+        <w:rPr>
+          <w:b/>
+          <w:bCs/>
+        </w:rPr>
+        <w:t>GenData</w:t>
+      </w:r>
+      <w:proofErr w:type="spellEnd"/>
+      <w:r>
+        <w:t xml:space="preserve">: After Configuration all module </w:t>
+      </w:r>
+      <w:proofErr w:type="spellStart"/>
+      <w:r>
+        <w:t>genearated</w:t>
+      </w:r>
+      <w:proofErr w:type="spellEnd"/>
+      <w:r>
+        <w:t xml:space="preserve"> </w:t>
+      </w:r>
+      <w:r>
+        <w:t>output files.</w:t>
+      </w:r>
+    </w:p>
+    <w:p>
+      <w:r>
+        <w:t>Source: Source code</w:t>
+      </w:r>
+    </w:p>
+    <w:p>
+      <w:r>
+        <w:t xml:space="preserve">Config: </w:t>
+      </w:r>
+    </w:p>
+    <w:p>
+      <w:pPr>
+        <w:pStyle w:val="ListParagraph"/>
+        <w:numPr>
+          <w:ilvl w:val="0"/>
+          <w:numId w:val="10"/>
+        </w:numPr>
+      </w:pPr>
+      <w:proofErr w:type="spellStart"/>
+      <w:r>
+        <w:t>Appl_component</w:t>
+      </w:r>
+      <w:proofErr w:type="spellEnd"/>
+      <w:r>
+        <w:t xml:space="preserve">: Put additional </w:t>
+      </w:r>
+      <w:proofErr w:type="spellStart"/>
+      <w:r>
+        <w:t>SWcType</w:t>
+      </w:r>
+      <w:proofErr w:type="spellEnd"/>
+      <w:r>
+        <w:t xml:space="preserve"> </w:t>
+      </w:r>
+      <w:r>
+        <w:t>the</w:t>
+      </w:r>
+      <w:r>
+        <w:t xml:space="preserve"> </w:t>
+      </w:r>
+      <w:proofErr w:type="spellStart"/>
+      <w:r>
+        <w:t>davinci</w:t>
+      </w:r>
+      <w:proofErr w:type="spellEnd"/>
+      <w:r>
+        <w:t xml:space="preserve"> </w:t>
+      </w:r>
+      <w:proofErr w:type="spellStart"/>
+      <w:r>
+        <w:t>confi</w:t>
+      </w:r>
+      <w:proofErr w:type="spellEnd"/>
+      <w:r>
+        <w:t xml:space="preserve"> pro – read </w:t>
+      </w:r>
+      <w:proofErr w:type="gramStart"/>
+      <w:r>
+        <w:t>all .arxml</w:t>
+      </w:r>
+      <w:proofErr w:type="gramEnd"/>
+      <w:r>
+        <w:t xml:space="preserve"> files of this folder</w:t>
+      </w:r>
+    </w:p>
+    <w:p>
+      <w:pPr>
+        <w:pStyle w:val="ListParagraph"/>
+        <w:numPr>
+          <w:ilvl w:val="0"/>
+          <w:numId w:val="10"/>
+        </w:numPr>
+      </w:pPr>
+      <w:r>
+        <w:t>Autosar: Def files of data type (Platform type</w:t>
+      </w:r>
+      <w:r>
+        <w:t xml:space="preserve">_AR4 arxml) </w:t>
+      </w:r>
+      <w:proofErr w:type="gramStart"/>
+      <w:r>
+        <w:t>is</w:t>
+      </w:r>
+      <w:proofErr w:type="gramEnd"/>
+      <w:r>
+        <w:t xml:space="preserve"> </w:t>
+      </w:r>
+      <w:proofErr w:type="spellStart"/>
+      <w:r>
+        <w:t>cenreally</w:t>
+      </w:r>
+      <w:proofErr w:type="spellEnd"/>
+      <w:r>
+        <w:t xml:space="preserve"> stored here.</w:t>
+      </w:r>
+    </w:p>
+    <w:p>
+      <w:r>
+        <w:t xml:space="preserve">Developers: </w:t>
+      </w:r>
+      <w:r>
+        <w:t xml:space="preserve">All </w:t>
+      </w:r>
+      <w:r>
+        <w:t>relevant project</w:t>
+      </w:r>
+      <w:r>
+        <w:t xml:space="preserve"> data for Dev </w:t>
+      </w:r>
+      <w:proofErr w:type="spellStart"/>
+      <w:r>
+        <w:t>Dev</w:t>
+      </w:r>
+      <w:proofErr w:type="spellEnd"/>
+      <w:r>
+        <w:t xml:space="preserve"> is located here</w:t>
+      </w:r>
+    </w:p>
+    <w:p>
+      <w:proofErr w:type="spellStart"/>
+      <w:r>
+        <w:lastRenderedPageBreak/>
+        <w:t>ECUc</w:t>
+      </w:r>
+      <w:proofErr w:type="spellEnd"/>
+      <w:r>
+        <w:t xml:space="preserve">: contains created </w:t>
+      </w:r>
+      <w:proofErr w:type="spellStart"/>
+      <w:r>
+        <w:t>ECUc</w:t>
+      </w:r>
+      <w:proofErr w:type="spellEnd"/>
+      <w:r>
+        <w:t xml:space="preserve"> files, before </w:t>
+      </w:r>
+      <w:r>
+        <w:t>you add input file, files are only place holder without con</w:t>
+      </w:r>
+      <w:r>
+        <w:t>tent.</w:t>
+      </w:r>
+    </w:p>
+    <w:p>
+      <w:r>
+        <w:t xml:space="preserve">Internal </w:t>
+      </w:r>
+      <w:r>
+        <w:t>Behavior: contain</w:t>
+      </w:r>
+      <w:r>
+        <w:t xml:space="preserve"> </w:t>
+      </w:r>
+      <w:proofErr w:type="spellStart"/>
+      <w:r>
+        <w:t>BSWmd</w:t>
+      </w:r>
+      <w:proofErr w:type="spellEnd"/>
+      <w:r>
+        <w:t xml:space="preserve"> files </w:t>
+      </w:r>
+      <w:r>
+        <w:t>for all activated modules in the Dev D.</w:t>
+      </w:r>
+    </w:p>
+    <w:p>
+      <w:r>
+        <w:t>Mc Data: Used to store measurement and calibrate data.</w:t>
+      </w:r>
+    </w:p>
+    <w:p>
+      <w:r>
+        <w:t>Service comp</w:t>
+      </w:r>
+      <w:r>
+        <w:t>on</w:t>
+      </w:r>
+      <w:r>
+        <w:t xml:space="preserve">ent: Dev Config stored all </w:t>
+      </w:r>
+      <w:r>
+        <w:t>generated service component prototype.</w:t>
+      </w:r>
+      <w:r>
+        <w:t xml:space="preserve"> </w:t>
+      </w:r>
+    </w:p>
+    <w:p>
+      <w:pPr>
+        <w:rPr>
+          <w:b/>
+          <w:bCs/>
+        </w:rPr>
+      </w:pPr>
+    </w:p>
+    <w:p/>
+    <w:p>
+      <w:r>
+        <w:br w:type="page"/>
+      </w:r>
+    </w:p>
+    <w:p>
+      <w:pPr>
         <w:ind w:left="360"/>
       </w:pPr>
       <w:proofErr w:type="spellStart"/>
       <w:r>
+        <w:lastRenderedPageBreak/>
         <w:t>dBC</w:t>
       </w:r>
       <w:proofErr w:type="spellEnd"/>
@@ -78,15 +1408,7 @@
         <w:sym w:font="Wingdings" w:char="F0E0"/>
       </w:r>
       <w:r>
-        <w:t xml:space="preserve"> based on configured container will generate separate </w:t>
-      </w:r>
-      <w:proofErr w:type="spellStart"/>
-      <w:r>
-        <w:t>arxml</w:t>
-      </w:r>
-      <w:proofErr w:type="spellEnd"/>
-      <w:r>
-        <w:t xml:space="preserve">, </w:t>
+        <w:t xml:space="preserve"> based on configured container will generate separate arxml, </w:t>
       </w:r>
       <w:r>
         <w:t xml:space="preserve">with module will generate PB config, L config, config .c .h </w:t>
@@ -98,15 +1420,7 @@
         <w:sym w:font="Wingdings" w:char="F0E0"/>
       </w:r>
       <w:r>
-        <w:t xml:space="preserve"> those gene rated </w:t>
-      </w:r>
-      <w:proofErr w:type="spellStart"/>
-      <w:r>
-        <w:t>arxml</w:t>
-      </w:r>
-      <w:proofErr w:type="spellEnd"/>
-      <w:r>
-        <w:t xml:space="preserve"> paths are available into </w:t>
+        <w:t xml:space="preserve"> those gene rated arxml paths are available into </w:t>
       </w:r>
       <w:proofErr w:type="spellStart"/>
       <w:r>
@@ -328,7 +1642,7 @@
 </file>
 
 <file path=word/numbering.xml><?xml version="1.0" encoding="utf-8"?>
-<w:numbering xmlns:wpc="http://schemas.microsoft.com/office/word/2010/wordprocessingCanvas" xmlns:cx="http://schemas.microsoft.com/office/drawing/2014/chartex" xmlns:cx1="http://schemas.microsoft.com/office/drawing/2015/9/8/chartex" xmlns:cx2="http://schemas.microsoft.com/office/drawing/2015/10/21/chartex" xmlns:cx3="http://schemas.microsoft.com/office/drawing/2016/5/9/chartex" xmlns:cx4="http://schemas.microsoft.com/office/drawing/2016/5/10/chartex" xmlns:cx5="http://schemas.microsoft.com/office/drawing/2016/5/11/chartex" xmlns:cx6="http://schemas.microsoft.com/office/drawing/2016/5/12/chartex" xmlns:cx7="http://schemas.microsoft.com/office/drawing/2016/5/13/chartex" xmlns:cx8="http://schemas.microsoft.com/office/drawing/2016/5/14/chartex" xmlns:mc="http://schemas.openxmlformats.org/markup-compatibility/2006" xmlns:aink="http://schemas.microsoft.com/office/drawing/2016/ink" xmlns:am3d="http://schemas.microsoft.com/office/drawing/2017/model3d" xmlns:o="urn:schemas-microsoft-com:office:office" xmlns:oel="http://schemas.microsoft.com/office/2019/extlst" xmlns:r="http://schemas.openxmlformats.org/officeDocument/2006/relationships" xmlns:m="http://schemas.openxmlformats.org/officeDocument/2006/math" xmlns:v="urn:schemas-microsoft-com:vml" xmlns:wp14="http://schemas.microsoft.com/office/word/2010/wordprocessingDrawing" xmlns:wp="http://schemas.openxmlformats.org/drawingml/2006/wordprocessingDrawing" xmlns:w10="urn:schemas-microsoft-com:office:word" xmlns:w="http://schemas.openxmlformats.org/wordprocessingml/2006/main" xmlns:w14="http://schemas.microsoft.com/office/word/2010/wordml" xmlns:w15="http://schemas.microsoft.com/office/word/2012/wordml" xmlns:w16cex="http://schemas.microsoft.com/office/word/2018/wordml/cex" xmlns:w16cid="http://schemas.microsoft.com/office/word/2016/wordml/cid" xmlns:w16="http://schemas.microsoft.com/office/word/2018/wordml" xmlns:w16du="http://schemas.microsoft.com/office/word/2023/wordml/word16du" xmlns:w16sdtdh="http://schemas.microsoft.com/office/word/2020/wordml/sdtdatahash" xmlns:w16sdtfl="http://schemas.microsoft.com/office/word/2024/wordml/sdtformatlock" xmlns:w16se="http://schemas.microsoft.com/office/word/2015/wordml/symex" xmlns:wpg="http://schemas.microsoft.com/office/word/2010/wordprocessingGroup" xmlns:wpi="http://schemas.microsoft.com/office/word/2010/wordprocessingInk" xmlns:wne="http://schemas.microsoft.com/office/word/2006/wordml" xmlns:wps="http://schemas.microsoft.com/office/word/2010/wordprocessingShape" mc:Ignorable="w14 w15 w16se w16cid w16 w16cex w16sdtdh w16sdtfl w16du wp14">
+<w:numbering xmlns:wpc="http://schemas.microsoft.com/office/word/2010/wordprocessingCanvas" xmlns:cx="http://schemas.microsoft.com/office/drawing/2014/chartex" xmlns:cx1="http://schemas.microsoft.com/office/drawing/2015/9/8/chartex" xmlns:cx2="http://schemas.microsoft.com/office/drawing/2015/10/21/chartex" xmlns:cx3="http://schemas.microsoft.com/office/drawing/2016/5/9/chartex" xmlns:cx4="http://schemas.microsoft.com/office/drawing/2016/5/10/chartex" xmlns:cx5="http://schemas.microsoft.com/office/drawing/2016/5/11/chartex" xmlns:cx6="http://schemas.microsoft.com/office/drawing/2016/5/12/chartex" xmlns:cx7="http://schemas.microsoft.com/office/drawing/2016/5/13/chartex" xmlns:cx8="http://schemas.microsoft.com/office/drawing/2016/5/14/chartex" xmlns:mc="http://schemas.openxmlformats.org/markup-compatibility/2006" xmlns:aink="http://schemas.microsoft.com/office/drawing/2016/ink" xmlns:am3d="http://schemas.microsoft.com/office/drawing/2017/model3d" xmlns:o="urn:schemas-microsoft-com:office:office" xmlns:oel="http://schemas.microsoft.com/office/2019/extlst" xmlns:r="http://schemas.openxmlformats.org/officeDocument/2006/relationships" xmlns:m="http://schemas.openxmlformats.org/officeDocument/2006/math" xmlns:v="urn:schemas-microsoft-com:vml" xmlns:wp14="http://schemas.microsoft.com/office/word/2010/wordprocessingDrawing" xmlns:wp="http://schemas.openxmlformats.org/drawingml/2006/wordprocessingDrawing" xmlns:w10="urn:schemas-microsoft-com:office:word" xmlns:w="http://schemas.openxmlformats.org/wordprocessingml/2006/main" xmlns:w14="http://schemas.microsoft.com/office/word/2010/wordml" xmlns:w15="http://schemas.microsoft.com/office/word/2012/wordml" xmlns:w16cei="http://schemas.microsoft.com/office/word/2026/wordml/cei" xmlns:w16cex="http://schemas.microsoft.com/office/word/2018/wordml/cex" xmlns:w16cid="http://schemas.microsoft.com/office/word/2016/wordml/cid" xmlns:w16="http://schemas.microsoft.com/office/word/2018/wordml" xmlns:w16du="http://schemas.microsoft.com/office/word/2023/wordml/word16du" xmlns:w16sdtdh="http://schemas.microsoft.com/office/word/2020/wordml/sdtdatahash" xmlns:w16sdtfl="http://schemas.microsoft.com/office/word/2024/wordml/sdtformatlock" xmlns:w16se="http://schemas.microsoft.com/office/word/2015/wordml/symex" xmlns:wpg="http://schemas.microsoft.com/office/word/2010/wordprocessingGroup" xmlns:wpi="http://schemas.microsoft.com/office/word/2010/wordprocessingInk" xmlns:wne="http://schemas.microsoft.com/office/word/2006/wordml" xmlns:wps="http://schemas.microsoft.com/office/word/2010/wordprocessingShape" mc:Ignorable="w14 w15 w16se w16cid w16 w16cex w16sdtdh w16sdtfl w16du wp14">
   <w:abstractNum w:abstractNumId="0" w15:restartNumberingAfterBreak="0">
     <w:nsid w:val="0E6C6D55"/>
     <w:multiLevelType w:val="multilevel"/>
@@ -479,6 +1793,613 @@
     </w:lvl>
   </w:abstractNum>
   <w:abstractNum w:abstractNumId="1" w15:restartNumberingAfterBreak="0">
+    <w:nsid w:val="231F0C36"/>
+    <w:multiLevelType w:val="hybridMultilevel"/>
+    <w:tmpl w:val="906AB9D2"/>
+    <w:lvl w:ilvl="0" w:tplc="04090001">
+      <w:start w:val="1"/>
+      <w:numFmt w:val="bullet"/>
+      <w:lvlText w:val=""/>
+      <w:lvlJc w:val="left"/>
+      <w:pPr>
+        <w:ind w:left="720" w:hanging="360"/>
+      </w:pPr>
+      <w:rPr>
+        <w:rFonts w:ascii="Symbol" w:hAnsi="Symbol" w:hint="default"/>
+      </w:rPr>
+    </w:lvl>
+    <w:lvl w:ilvl="1" w:tplc="04090003" w:tentative="1">
+      <w:start w:val="1"/>
+      <w:numFmt w:val="bullet"/>
+      <w:lvlText w:val="o"/>
+      <w:lvlJc w:val="left"/>
+      <w:pPr>
+        <w:ind w:left="1440" w:hanging="360"/>
+      </w:pPr>
+      <w:rPr>
+        <w:rFonts w:ascii="Courier New" w:hAnsi="Courier New" w:cs="Courier New" w:hint="default"/>
+      </w:rPr>
+    </w:lvl>
+    <w:lvl w:ilvl="2" w:tplc="04090005" w:tentative="1">
+      <w:start w:val="1"/>
+      <w:numFmt w:val="bullet"/>
+      <w:lvlText w:val=""/>
+      <w:lvlJc w:val="left"/>
+      <w:pPr>
+        <w:ind w:left="2160" w:hanging="360"/>
+      </w:pPr>
+      <w:rPr>
+        <w:rFonts w:ascii="Wingdings" w:hAnsi="Wingdings" w:hint="default"/>
+      </w:rPr>
+    </w:lvl>
+    <w:lvl w:ilvl="3" w:tplc="04090001" w:tentative="1">
+      <w:start w:val="1"/>
+      <w:numFmt w:val="bullet"/>
+      <w:lvlText w:val=""/>
+      <w:lvlJc w:val="left"/>
+      <w:pPr>
+        <w:ind w:left="2880" w:hanging="360"/>
+      </w:pPr>
+      <w:rPr>
+        <w:rFonts w:ascii="Symbol" w:hAnsi="Symbol" w:hint="default"/>
+      </w:rPr>
+    </w:lvl>
+    <w:lvl w:ilvl="4" w:tplc="04090003" w:tentative="1">
+      <w:start w:val="1"/>
+      <w:numFmt w:val="bullet"/>
+      <w:lvlText w:val="o"/>
+      <w:lvlJc w:val="left"/>
+      <w:pPr>
+        <w:ind w:left="3600" w:hanging="360"/>
+      </w:pPr>
+      <w:rPr>
+        <w:rFonts w:ascii="Courier New" w:hAnsi="Courier New" w:cs="Courier New" w:hint="default"/>
+      </w:rPr>
+    </w:lvl>
+    <w:lvl w:ilvl="5" w:tplc="04090005" w:tentative="1">
+      <w:start w:val="1"/>
+      <w:numFmt w:val="bullet"/>
+      <w:lvlText w:val=""/>
+      <w:lvlJc w:val="left"/>
+      <w:pPr>
+        <w:ind w:left="4320" w:hanging="360"/>
+      </w:pPr>
+      <w:rPr>
+        <w:rFonts w:ascii="Wingdings" w:hAnsi="Wingdings" w:hint="default"/>
+      </w:rPr>
+    </w:lvl>
+    <w:lvl w:ilvl="6" w:tplc="04090001" w:tentative="1">
+      <w:start w:val="1"/>
+      <w:numFmt w:val="bullet"/>
+      <w:lvlText w:val=""/>
+      <w:lvlJc w:val="left"/>
+      <w:pPr>
+        <w:ind w:left="5040" w:hanging="360"/>
+      </w:pPr>
+      <w:rPr>
+        <w:rFonts w:ascii="Symbol" w:hAnsi="Symbol" w:hint="default"/>
+      </w:rPr>
+    </w:lvl>
+    <w:lvl w:ilvl="7" w:tplc="04090003" w:tentative="1">
+      <w:start w:val="1"/>
+      <w:numFmt w:val="bullet"/>
+      <w:lvlText w:val="o"/>
+      <w:lvlJc w:val="left"/>
+      <w:pPr>
+        <w:ind w:left="5760" w:hanging="360"/>
+      </w:pPr>
+      <w:rPr>
+        <w:rFonts w:ascii="Courier New" w:hAnsi="Courier New" w:cs="Courier New" w:hint="default"/>
+      </w:rPr>
+    </w:lvl>
+    <w:lvl w:ilvl="8" w:tplc="04090005" w:tentative="1">
+      <w:start w:val="1"/>
+      <w:numFmt w:val="bullet"/>
+      <w:lvlText w:val=""/>
+      <w:lvlJc w:val="left"/>
+      <w:pPr>
+        <w:ind w:left="6480" w:hanging="360"/>
+      </w:pPr>
+      <w:rPr>
+        <w:rFonts w:ascii="Wingdings" w:hAnsi="Wingdings" w:hint="default"/>
+      </w:rPr>
+    </w:lvl>
+  </w:abstractNum>
+  <w:abstractNum w:abstractNumId="2" w15:restartNumberingAfterBreak="0">
+    <w:nsid w:val="2A8A2A37"/>
+    <w:multiLevelType w:val="hybridMultilevel"/>
+    <w:tmpl w:val="FD74CD5A"/>
+    <w:lvl w:ilvl="0" w:tplc="0409000F">
+      <w:start w:val="1"/>
+      <w:numFmt w:val="decimal"/>
+      <w:lvlText w:val="%1."/>
+      <w:lvlJc w:val="left"/>
+      <w:pPr>
+        <w:ind w:left="720" w:hanging="360"/>
+      </w:pPr>
+      <w:rPr>
+        <w:rFonts w:hint="default"/>
+      </w:rPr>
+    </w:lvl>
+    <w:lvl w:ilvl="1" w:tplc="04090019" w:tentative="1">
+      <w:start w:val="1"/>
+      <w:numFmt w:val="lowerLetter"/>
+      <w:lvlText w:val="%2."/>
+      <w:lvlJc w:val="left"/>
+      <w:pPr>
+        <w:ind w:left="1440" w:hanging="360"/>
+      </w:pPr>
+    </w:lvl>
+    <w:lvl w:ilvl="2" w:tplc="0409001B" w:tentative="1">
+      <w:start w:val="1"/>
+      <w:numFmt w:val="lowerRoman"/>
+      <w:lvlText w:val="%3."/>
+      <w:lvlJc w:val="right"/>
+      <w:pPr>
+        <w:ind w:left="2160" w:hanging="180"/>
+      </w:pPr>
+    </w:lvl>
+    <w:lvl w:ilvl="3" w:tplc="0409000F" w:tentative="1">
+      <w:start w:val="1"/>
+      <w:numFmt w:val="decimal"/>
+      <w:lvlText w:val="%4."/>
+      <w:lvlJc w:val="left"/>
+      <w:pPr>
+        <w:ind w:left="2880" w:hanging="360"/>
+      </w:pPr>
+    </w:lvl>
+    <w:lvl w:ilvl="4" w:tplc="04090019" w:tentative="1">
+      <w:start w:val="1"/>
+      <w:numFmt w:val="lowerLetter"/>
+      <w:lvlText w:val="%5."/>
+      <w:lvlJc w:val="left"/>
+      <w:pPr>
+        <w:ind w:left="3600" w:hanging="360"/>
+      </w:pPr>
+    </w:lvl>
+    <w:lvl w:ilvl="5" w:tplc="0409001B" w:tentative="1">
+      <w:start w:val="1"/>
+      <w:numFmt w:val="lowerRoman"/>
+      <w:lvlText w:val="%6."/>
+      <w:lvlJc w:val="right"/>
+      <w:pPr>
+        <w:ind w:left="4320" w:hanging="180"/>
+      </w:pPr>
+    </w:lvl>
+    <w:lvl w:ilvl="6" w:tplc="0409000F" w:tentative="1">
+      <w:start w:val="1"/>
+      <w:numFmt w:val="decimal"/>
+      <w:lvlText w:val="%7."/>
+      <w:lvlJc w:val="left"/>
+      <w:pPr>
+        <w:ind w:left="5040" w:hanging="360"/>
+      </w:pPr>
+    </w:lvl>
+    <w:lvl w:ilvl="7" w:tplc="04090019" w:tentative="1">
+      <w:start w:val="1"/>
+      <w:numFmt w:val="lowerLetter"/>
+      <w:lvlText w:val="%8."/>
+      <w:lvlJc w:val="left"/>
+      <w:pPr>
+        <w:ind w:left="5760" w:hanging="360"/>
+      </w:pPr>
+    </w:lvl>
+    <w:lvl w:ilvl="8" w:tplc="0409001B" w:tentative="1">
+      <w:start w:val="1"/>
+      <w:numFmt w:val="lowerRoman"/>
+      <w:lvlText w:val="%9."/>
+      <w:lvlJc w:val="right"/>
+      <w:pPr>
+        <w:ind w:left="6480" w:hanging="180"/>
+      </w:pPr>
+    </w:lvl>
+  </w:abstractNum>
+  <w:abstractNum w:abstractNumId="3" w15:restartNumberingAfterBreak="0">
+    <w:nsid w:val="2D35157B"/>
+    <w:multiLevelType w:val="hybridMultilevel"/>
+    <w:tmpl w:val="E84C57C6"/>
+    <w:lvl w:ilvl="0" w:tplc="04090001">
+      <w:start w:val="1"/>
+      <w:numFmt w:val="bullet"/>
+      <w:lvlText w:val=""/>
+      <w:lvlJc w:val="left"/>
+      <w:pPr>
+        <w:ind w:left="1080" w:hanging="360"/>
+      </w:pPr>
+      <w:rPr>
+        <w:rFonts w:ascii="Symbol" w:hAnsi="Symbol" w:hint="default"/>
+      </w:rPr>
+    </w:lvl>
+    <w:lvl w:ilvl="1" w:tplc="04090003" w:tentative="1">
+      <w:start w:val="1"/>
+      <w:numFmt w:val="bullet"/>
+      <w:lvlText w:val="o"/>
+      <w:lvlJc w:val="left"/>
+      <w:pPr>
+        <w:ind w:left="1800" w:hanging="360"/>
+      </w:pPr>
+      <w:rPr>
+        <w:rFonts w:ascii="Courier New" w:hAnsi="Courier New" w:cs="Courier New" w:hint="default"/>
+      </w:rPr>
+    </w:lvl>
+    <w:lvl w:ilvl="2" w:tplc="04090005" w:tentative="1">
+      <w:start w:val="1"/>
+      <w:numFmt w:val="bullet"/>
+      <w:lvlText w:val=""/>
+      <w:lvlJc w:val="left"/>
+      <w:pPr>
+        <w:ind w:left="2520" w:hanging="360"/>
+      </w:pPr>
+      <w:rPr>
+        <w:rFonts w:ascii="Wingdings" w:hAnsi="Wingdings" w:hint="default"/>
+      </w:rPr>
+    </w:lvl>
+    <w:lvl w:ilvl="3" w:tplc="04090001" w:tentative="1">
+      <w:start w:val="1"/>
+      <w:numFmt w:val="bullet"/>
+      <w:lvlText w:val=""/>
+      <w:lvlJc w:val="left"/>
+      <w:pPr>
+        <w:ind w:left="3240" w:hanging="360"/>
+      </w:pPr>
+      <w:rPr>
+        <w:rFonts w:ascii="Symbol" w:hAnsi="Symbol" w:hint="default"/>
+      </w:rPr>
+    </w:lvl>
+    <w:lvl w:ilvl="4" w:tplc="04090003" w:tentative="1">
+      <w:start w:val="1"/>
+      <w:numFmt w:val="bullet"/>
+      <w:lvlText w:val="o"/>
+      <w:lvlJc w:val="left"/>
+      <w:pPr>
+        <w:ind w:left="3960" w:hanging="360"/>
+      </w:pPr>
+      <w:rPr>
+        <w:rFonts w:ascii="Courier New" w:hAnsi="Courier New" w:cs="Courier New" w:hint="default"/>
+      </w:rPr>
+    </w:lvl>
+    <w:lvl w:ilvl="5" w:tplc="04090005" w:tentative="1">
+      <w:start w:val="1"/>
+      <w:numFmt w:val="bullet"/>
+      <w:lvlText w:val=""/>
+      <w:lvlJc w:val="left"/>
+      <w:pPr>
+        <w:ind w:left="4680" w:hanging="360"/>
+      </w:pPr>
+      <w:rPr>
+        <w:rFonts w:ascii="Wingdings" w:hAnsi="Wingdings" w:hint="default"/>
+      </w:rPr>
+    </w:lvl>
+    <w:lvl w:ilvl="6" w:tplc="04090001" w:tentative="1">
+      <w:start w:val="1"/>
+      <w:numFmt w:val="bullet"/>
+      <w:lvlText w:val=""/>
+      <w:lvlJc w:val="left"/>
+      <w:pPr>
+        <w:ind w:left="5400" w:hanging="360"/>
+      </w:pPr>
+      <w:rPr>
+        <w:rFonts w:ascii="Symbol" w:hAnsi="Symbol" w:hint="default"/>
+      </w:rPr>
+    </w:lvl>
+    <w:lvl w:ilvl="7" w:tplc="04090003" w:tentative="1">
+      <w:start w:val="1"/>
+      <w:numFmt w:val="bullet"/>
+      <w:lvlText w:val="o"/>
+      <w:lvlJc w:val="left"/>
+      <w:pPr>
+        <w:ind w:left="6120" w:hanging="360"/>
+      </w:pPr>
+      <w:rPr>
+        <w:rFonts w:ascii="Courier New" w:hAnsi="Courier New" w:cs="Courier New" w:hint="default"/>
+      </w:rPr>
+    </w:lvl>
+    <w:lvl w:ilvl="8" w:tplc="04090005" w:tentative="1">
+      <w:start w:val="1"/>
+      <w:numFmt w:val="bullet"/>
+      <w:lvlText w:val=""/>
+      <w:lvlJc w:val="left"/>
+      <w:pPr>
+        <w:ind w:left="6840" w:hanging="360"/>
+      </w:pPr>
+      <w:rPr>
+        <w:rFonts w:ascii="Wingdings" w:hAnsi="Wingdings" w:hint="default"/>
+      </w:rPr>
+    </w:lvl>
+  </w:abstractNum>
+  <w:abstractNum w:abstractNumId="4" w15:restartNumberingAfterBreak="0">
+    <w:nsid w:val="3C3C13BB"/>
+    <w:multiLevelType w:val="hybridMultilevel"/>
+    <w:tmpl w:val="9D0EA2C8"/>
+    <w:lvl w:ilvl="0" w:tplc="0DC0D294">
+      <w:start w:val="1"/>
+      <w:numFmt w:val="bullet"/>
+      <w:lvlText w:val=""/>
+      <w:lvlJc w:val="left"/>
+      <w:pPr>
+        <w:ind w:left="2760" w:hanging="360"/>
+      </w:pPr>
+      <w:rPr>
+        <w:rFonts w:ascii="Wingdings" w:eastAsiaTheme="minorHAnsi" w:hAnsi="Wingdings" w:cstheme="minorBidi" w:hint="default"/>
+        <w:b w:val="0"/>
+      </w:rPr>
+    </w:lvl>
+    <w:lvl w:ilvl="1" w:tplc="04090003" w:tentative="1">
+      <w:start w:val="1"/>
+      <w:numFmt w:val="bullet"/>
+      <w:lvlText w:val="o"/>
+      <w:lvlJc w:val="left"/>
+      <w:pPr>
+        <w:ind w:left="3480" w:hanging="360"/>
+      </w:pPr>
+      <w:rPr>
+        <w:rFonts w:ascii="Courier New" w:hAnsi="Courier New" w:cs="Courier New" w:hint="default"/>
+      </w:rPr>
+    </w:lvl>
+    <w:lvl w:ilvl="2" w:tplc="04090005" w:tentative="1">
+      <w:start w:val="1"/>
+      <w:numFmt w:val="bullet"/>
+      <w:lvlText w:val=""/>
+      <w:lvlJc w:val="left"/>
+      <w:pPr>
+        <w:ind w:left="4200" w:hanging="360"/>
+      </w:pPr>
+      <w:rPr>
+        <w:rFonts w:ascii="Wingdings" w:hAnsi="Wingdings" w:hint="default"/>
+      </w:rPr>
+    </w:lvl>
+    <w:lvl w:ilvl="3" w:tplc="04090001" w:tentative="1">
+      <w:start w:val="1"/>
+      <w:numFmt w:val="bullet"/>
+      <w:lvlText w:val=""/>
+      <w:lvlJc w:val="left"/>
+      <w:pPr>
+        <w:ind w:left="4920" w:hanging="360"/>
+      </w:pPr>
+      <w:rPr>
+        <w:rFonts w:ascii="Symbol" w:hAnsi="Symbol" w:hint="default"/>
+      </w:rPr>
+    </w:lvl>
+    <w:lvl w:ilvl="4" w:tplc="04090003" w:tentative="1">
+      <w:start w:val="1"/>
+      <w:numFmt w:val="bullet"/>
+      <w:lvlText w:val="o"/>
+      <w:lvlJc w:val="left"/>
+      <w:pPr>
+        <w:ind w:left="5640" w:hanging="360"/>
+      </w:pPr>
+      <w:rPr>
+        <w:rFonts w:ascii="Courier New" w:hAnsi="Courier New" w:cs="Courier New" w:hint="default"/>
+      </w:rPr>
+    </w:lvl>
+    <w:lvl w:ilvl="5" w:tplc="04090005" w:tentative="1">
+      <w:start w:val="1"/>
+      <w:numFmt w:val="bullet"/>
+      <w:lvlText w:val=""/>
+      <w:lvlJc w:val="left"/>
+      <w:pPr>
+        <w:ind w:left="6360" w:hanging="360"/>
+      </w:pPr>
+      <w:rPr>
+        <w:rFonts w:ascii="Wingdings" w:hAnsi="Wingdings" w:hint="default"/>
+      </w:rPr>
+    </w:lvl>
+    <w:lvl w:ilvl="6" w:tplc="04090001" w:tentative="1">
+      <w:start w:val="1"/>
+      <w:numFmt w:val="bullet"/>
+      <w:lvlText w:val=""/>
+      <w:lvlJc w:val="left"/>
+      <w:pPr>
+        <w:ind w:left="7080" w:hanging="360"/>
+      </w:pPr>
+      <w:rPr>
+        <w:rFonts w:ascii="Symbol" w:hAnsi="Symbol" w:hint="default"/>
+      </w:rPr>
+    </w:lvl>
+    <w:lvl w:ilvl="7" w:tplc="04090003" w:tentative="1">
+      <w:start w:val="1"/>
+      <w:numFmt w:val="bullet"/>
+      <w:lvlText w:val="o"/>
+      <w:lvlJc w:val="left"/>
+      <w:pPr>
+        <w:ind w:left="7800" w:hanging="360"/>
+      </w:pPr>
+      <w:rPr>
+        <w:rFonts w:ascii="Courier New" w:hAnsi="Courier New" w:cs="Courier New" w:hint="default"/>
+      </w:rPr>
+    </w:lvl>
+    <w:lvl w:ilvl="8" w:tplc="04090005" w:tentative="1">
+      <w:start w:val="1"/>
+      <w:numFmt w:val="bullet"/>
+      <w:lvlText w:val=""/>
+      <w:lvlJc w:val="left"/>
+      <w:pPr>
+        <w:ind w:left="8520" w:hanging="360"/>
+      </w:pPr>
+      <w:rPr>
+        <w:rFonts w:ascii="Wingdings" w:hAnsi="Wingdings" w:hint="default"/>
+      </w:rPr>
+    </w:lvl>
+  </w:abstractNum>
+  <w:abstractNum w:abstractNumId="5" w15:restartNumberingAfterBreak="0">
+    <w:nsid w:val="3EC66396"/>
+    <w:multiLevelType w:val="hybridMultilevel"/>
+    <w:tmpl w:val="DE60AE92"/>
+    <w:lvl w:ilvl="0" w:tplc="D8CA3CCC">
+      <w:start w:val="1"/>
+      <w:numFmt w:val="lowerLetter"/>
+      <w:lvlText w:val="%1."/>
+      <w:lvlJc w:val="left"/>
+      <w:pPr>
+        <w:ind w:left="1090" w:hanging="360"/>
+      </w:pPr>
+      <w:rPr>
+        <w:rFonts w:hint="default"/>
+      </w:rPr>
+    </w:lvl>
+    <w:lvl w:ilvl="1" w:tplc="04090019" w:tentative="1">
+      <w:start w:val="1"/>
+      <w:numFmt w:val="lowerLetter"/>
+      <w:lvlText w:val="%2."/>
+      <w:lvlJc w:val="left"/>
+      <w:pPr>
+        <w:ind w:left="1810" w:hanging="360"/>
+      </w:pPr>
+    </w:lvl>
+    <w:lvl w:ilvl="2" w:tplc="0409001B" w:tentative="1">
+      <w:start w:val="1"/>
+      <w:numFmt w:val="lowerRoman"/>
+      <w:lvlText w:val="%3."/>
+      <w:lvlJc w:val="right"/>
+      <w:pPr>
+        <w:ind w:left="2530" w:hanging="180"/>
+      </w:pPr>
+    </w:lvl>
+    <w:lvl w:ilvl="3" w:tplc="0409000F" w:tentative="1">
+      <w:start w:val="1"/>
+      <w:numFmt w:val="decimal"/>
+      <w:lvlText w:val="%4."/>
+      <w:lvlJc w:val="left"/>
+      <w:pPr>
+        <w:ind w:left="3250" w:hanging="360"/>
+      </w:pPr>
+    </w:lvl>
+    <w:lvl w:ilvl="4" w:tplc="04090019" w:tentative="1">
+      <w:start w:val="1"/>
+      <w:numFmt w:val="lowerLetter"/>
+      <w:lvlText w:val="%5."/>
+      <w:lvlJc w:val="left"/>
+      <w:pPr>
+        <w:ind w:left="3970" w:hanging="360"/>
+      </w:pPr>
+    </w:lvl>
+    <w:lvl w:ilvl="5" w:tplc="0409001B" w:tentative="1">
+      <w:start w:val="1"/>
+      <w:numFmt w:val="lowerRoman"/>
+      <w:lvlText w:val="%6."/>
+      <w:lvlJc w:val="right"/>
+      <w:pPr>
+        <w:ind w:left="4690" w:hanging="180"/>
+      </w:pPr>
+    </w:lvl>
+    <w:lvl w:ilvl="6" w:tplc="0409000F" w:tentative="1">
+      <w:start w:val="1"/>
+      <w:numFmt w:val="decimal"/>
+      <w:lvlText w:val="%7."/>
+      <w:lvlJc w:val="left"/>
+      <w:pPr>
+        <w:ind w:left="5410" w:hanging="360"/>
+      </w:pPr>
+    </w:lvl>
+    <w:lvl w:ilvl="7" w:tplc="04090019" w:tentative="1">
+      <w:start w:val="1"/>
+      <w:numFmt w:val="lowerLetter"/>
+      <w:lvlText w:val="%8."/>
+      <w:lvlJc w:val="left"/>
+      <w:pPr>
+        <w:ind w:left="6130" w:hanging="360"/>
+      </w:pPr>
+    </w:lvl>
+    <w:lvl w:ilvl="8" w:tplc="0409001B" w:tentative="1">
+      <w:start w:val="1"/>
+      <w:numFmt w:val="lowerRoman"/>
+      <w:lvlText w:val="%9."/>
+      <w:lvlJc w:val="right"/>
+      <w:pPr>
+        <w:ind w:left="6850" w:hanging="180"/>
+      </w:pPr>
+    </w:lvl>
+  </w:abstractNum>
+  <w:abstractNum w:abstractNumId="6" w15:restartNumberingAfterBreak="0">
+    <w:nsid w:val="4206312A"/>
+    <w:multiLevelType w:val="hybridMultilevel"/>
+    <w:tmpl w:val="8320D7AA"/>
+    <w:lvl w:ilvl="0" w:tplc="0409000F">
+      <w:start w:val="1"/>
+      <w:numFmt w:val="decimal"/>
+      <w:lvlText w:val="%1."/>
+      <w:lvlJc w:val="left"/>
+      <w:pPr>
+        <w:ind w:left="720" w:hanging="360"/>
+      </w:pPr>
+      <w:rPr>
+        <w:rFonts w:hint="default"/>
+      </w:rPr>
+    </w:lvl>
+    <w:lvl w:ilvl="1" w:tplc="04090019" w:tentative="1">
+      <w:start w:val="1"/>
+      <w:numFmt w:val="lowerLetter"/>
+      <w:lvlText w:val="%2."/>
+      <w:lvlJc w:val="left"/>
+      <w:pPr>
+        <w:ind w:left="1440" w:hanging="360"/>
+      </w:pPr>
+    </w:lvl>
+    <w:lvl w:ilvl="2" w:tplc="0409001B" w:tentative="1">
+      <w:start w:val="1"/>
+      <w:numFmt w:val="lowerRoman"/>
+      <w:lvlText w:val="%3."/>
+      <w:lvlJc w:val="right"/>
+      <w:pPr>
+        <w:ind w:left="2160" w:hanging="180"/>
+      </w:pPr>
+    </w:lvl>
+    <w:lvl w:ilvl="3" w:tplc="0409000F" w:tentative="1">
+      <w:start w:val="1"/>
+      <w:numFmt w:val="decimal"/>
+      <w:lvlText w:val="%4."/>
+      <w:lvlJc w:val="left"/>
+      <w:pPr>
+        <w:ind w:left="2880" w:hanging="360"/>
+      </w:pPr>
+    </w:lvl>
+    <w:lvl w:ilvl="4" w:tplc="04090019" w:tentative="1">
+      <w:start w:val="1"/>
+      <w:numFmt w:val="lowerLetter"/>
+      <w:lvlText w:val="%5."/>
+      <w:lvlJc w:val="left"/>
+      <w:pPr>
+        <w:ind w:left="3600" w:hanging="360"/>
+      </w:pPr>
+    </w:lvl>
+    <w:lvl w:ilvl="5" w:tplc="0409001B" w:tentative="1">
+      <w:start w:val="1"/>
+      <w:numFmt w:val="lowerRoman"/>
+      <w:lvlText w:val="%6."/>
+      <w:lvlJc w:val="right"/>
+      <w:pPr>
+        <w:ind w:left="4320" w:hanging="180"/>
+      </w:pPr>
+    </w:lvl>
+    <w:lvl w:ilvl="6" w:tplc="0409000F" w:tentative="1">
+      <w:start w:val="1"/>
+      <w:numFmt w:val="decimal"/>
+      <w:lvlText w:val="%7."/>
+      <w:lvlJc w:val="left"/>
+      <w:pPr>
+        <w:ind w:left="5040" w:hanging="360"/>
+      </w:pPr>
+    </w:lvl>
+    <w:lvl w:ilvl="7" w:tplc="04090019" w:tentative="1">
+      <w:start w:val="1"/>
+      <w:numFmt w:val="lowerLetter"/>
+      <w:lvlText w:val="%8."/>
+      <w:lvlJc w:val="left"/>
+      <w:pPr>
+        <w:ind w:left="5760" w:hanging="360"/>
+      </w:pPr>
+    </w:lvl>
+    <w:lvl w:ilvl="8" w:tplc="0409001B" w:tentative="1">
+      <w:start w:val="1"/>
+      <w:numFmt w:val="lowerRoman"/>
+      <w:lvlText w:val="%9."/>
+      <w:lvlJc w:val="right"/>
+      <w:pPr>
+        <w:ind w:left="6480" w:hanging="180"/>
+      </w:pPr>
+    </w:lvl>
+  </w:abstractNum>
+  <w:abstractNum w:abstractNumId="7" w15:restartNumberingAfterBreak="0">
     <w:nsid w:val="4D573B1F"/>
     <w:multiLevelType w:val="multilevel"/>
     <w:tmpl w:val="C820FACC"/>
@@ -627,7 +2548,7 @@
       </w:rPr>
     </w:lvl>
   </w:abstractNum>
-  <w:abstractNum w:abstractNumId="2" w15:restartNumberingAfterBreak="0">
+  <w:abstractNum w:abstractNumId="8" w15:restartNumberingAfterBreak="0">
     <w:nsid w:val="740E117B"/>
     <w:multiLevelType w:val="hybridMultilevel"/>
     <w:tmpl w:val="0B62F6DE"/>
@@ -716,14 +2637,124 @@
       </w:pPr>
     </w:lvl>
   </w:abstractNum>
+  <w:abstractNum w:abstractNumId="9" w15:restartNumberingAfterBreak="0">
+    <w:nsid w:val="7C2A222F"/>
+    <w:multiLevelType w:val="hybridMultilevel"/>
+    <w:tmpl w:val="A8A2DC60"/>
+    <w:lvl w:ilvl="0" w:tplc="1048F708">
+      <w:start w:val="1"/>
+      <w:numFmt w:val="decimal"/>
+      <w:lvlText w:val="%1."/>
+      <w:lvlJc w:val="left"/>
+      <w:pPr>
+        <w:ind w:left="1080" w:hanging="360"/>
+      </w:pPr>
+      <w:rPr>
+        <w:rFonts w:hint="default"/>
+      </w:rPr>
+    </w:lvl>
+    <w:lvl w:ilvl="1" w:tplc="04090019" w:tentative="1">
+      <w:start w:val="1"/>
+      <w:numFmt w:val="lowerLetter"/>
+      <w:lvlText w:val="%2."/>
+      <w:lvlJc w:val="left"/>
+      <w:pPr>
+        <w:ind w:left="1800" w:hanging="360"/>
+      </w:pPr>
+    </w:lvl>
+    <w:lvl w:ilvl="2" w:tplc="0409001B" w:tentative="1">
+      <w:start w:val="1"/>
+      <w:numFmt w:val="lowerRoman"/>
+      <w:lvlText w:val="%3."/>
+      <w:lvlJc w:val="right"/>
+      <w:pPr>
+        <w:ind w:left="2520" w:hanging="180"/>
+      </w:pPr>
+    </w:lvl>
+    <w:lvl w:ilvl="3" w:tplc="0409000F" w:tentative="1">
+      <w:start w:val="1"/>
+      <w:numFmt w:val="decimal"/>
+      <w:lvlText w:val="%4."/>
+      <w:lvlJc w:val="left"/>
+      <w:pPr>
+        <w:ind w:left="3240" w:hanging="360"/>
+      </w:pPr>
+    </w:lvl>
+    <w:lvl w:ilvl="4" w:tplc="04090019" w:tentative="1">
+      <w:start w:val="1"/>
+      <w:numFmt w:val="lowerLetter"/>
+      <w:lvlText w:val="%5."/>
+      <w:lvlJc w:val="left"/>
+      <w:pPr>
+        <w:ind w:left="3960" w:hanging="360"/>
+      </w:pPr>
+    </w:lvl>
+    <w:lvl w:ilvl="5" w:tplc="0409001B" w:tentative="1">
+      <w:start w:val="1"/>
+      <w:numFmt w:val="lowerRoman"/>
+      <w:lvlText w:val="%6."/>
+      <w:lvlJc w:val="right"/>
+      <w:pPr>
+        <w:ind w:left="4680" w:hanging="180"/>
+      </w:pPr>
+    </w:lvl>
+    <w:lvl w:ilvl="6" w:tplc="0409000F" w:tentative="1">
+      <w:start w:val="1"/>
+      <w:numFmt w:val="decimal"/>
+      <w:lvlText w:val="%7."/>
+      <w:lvlJc w:val="left"/>
+      <w:pPr>
+        <w:ind w:left="5400" w:hanging="360"/>
+      </w:pPr>
+    </w:lvl>
+    <w:lvl w:ilvl="7" w:tplc="04090019" w:tentative="1">
+      <w:start w:val="1"/>
+      <w:numFmt w:val="lowerLetter"/>
+      <w:lvlText w:val="%8."/>
+      <w:lvlJc w:val="left"/>
+      <w:pPr>
+        <w:ind w:left="6120" w:hanging="360"/>
+      </w:pPr>
+    </w:lvl>
+    <w:lvl w:ilvl="8" w:tplc="0409001B" w:tentative="1">
+      <w:start w:val="1"/>
+      <w:numFmt w:val="lowerRoman"/>
+      <w:lvlText w:val="%9."/>
+      <w:lvlJc w:val="right"/>
+      <w:pPr>
+        <w:ind w:left="6840" w:hanging="180"/>
+      </w:pPr>
+    </w:lvl>
+  </w:abstractNum>
   <w:num w:numId="1" w16cid:durableId="111874392">
-    <w:abstractNumId w:val="2"/>
+    <w:abstractNumId w:val="8"/>
   </w:num>
   <w:num w:numId="2" w16cid:durableId="468323640">
     <w:abstractNumId w:val="0"/>
   </w:num>
   <w:num w:numId="3" w16cid:durableId="158623828">
+    <w:abstractNumId w:val="7"/>
+  </w:num>
+  <w:num w:numId="4" w16cid:durableId="1909919033">
+    <w:abstractNumId w:val="2"/>
+  </w:num>
+  <w:num w:numId="5" w16cid:durableId="1553808565">
+    <w:abstractNumId w:val="3"/>
+  </w:num>
+  <w:num w:numId="6" w16cid:durableId="1798377619">
+    <w:abstractNumId w:val="4"/>
+  </w:num>
+  <w:num w:numId="7" w16cid:durableId="2050952012">
     <w:abstractNumId w:val="1"/>
+  </w:num>
+  <w:num w:numId="8" w16cid:durableId="2112045348">
+    <w:abstractNumId w:val="6"/>
+  </w:num>
+  <w:num w:numId="9" w16cid:durableId="1855919855">
+    <w:abstractNumId w:val="9"/>
+  </w:num>
+  <w:num w:numId="10" w16cid:durableId="1778597314">
+    <w:abstractNumId w:val="5"/>
   </w:num>
 </w:numbering>
 </file>
@@ -1331,6 +3362,7 @@
   <w:style w:type="character" w:default="1" w:styleId="DefaultParagraphFont">
     <w:name w:val="Default Paragraph Font"/>
     <w:uiPriority w:val="1"/>
+    <w:semiHidden/>
     <w:unhideWhenUsed/>
   </w:style>
   <w:style w:type="table" w:default="1" w:styleId="TableNormal">

</xml_diff>